<commit_message>
docs: digest v2 — real round data + actual donor grant framing, drop next-steps
Co-Authored-By: Claude Fable 5 <noreply@anthropic.com>
</commit_message>
<xml_diff>
--- a/docs/Platform_Update_QA_QCF_Grant_2026-07-16.docx
+++ b/docs/Platform_Update_QA_QCF_Grant_2026-07-16.docx
@@ -12,7 +12,7 @@
           <w:color w:val="1F3864"/>
           <w:sz w:val="32"/>
         </w:rPr>
-        <w:t>Platform Update — QA Fixes, Cleaner Pages, and the QCF Grant Goes Live</w:t>
+        <w:t>Platform Update — Real Round Data, a Real Donor Grant, and a Clean QA Slate</w:t>
       </w:r>
     </w:p>
     <w:p>
@@ -46,7 +46,7 @@
         <w:spacing w:after="80"/>
       </w:pPr>
       <w:r>
-        <w:t>Two days, four workstreams: the QA team’s findings were all fixed; the two busiest screens were redesigned after feedback; the real $2M QCF grant that funds the Proximate pilot is now fully in the system and tied to the Blue Nile round; and QCF has its own donor portal login where it can watch the round and download its reports. The Blue Nile round now has money, a donor, a panel roster, and 62 partner organizations — the endorsement pipeline is the remaining step before disbursements.</w:t>
+        <w:t>This is a milestone update: the system now holds real data for a real funding round. The complete Blue Nile Cycle package — 62 partner organizations with their intake forms, screening evidence, media checks, and the panel roster — is uploaded and awaiting processing. The actual donor grant that funds this round, $2M from Quadrature Climate Foundation, is in the system end to end: agreement, money, reporting, and a live donor portal for QCF. Alongside that, every finding from the QA round was fixed, and the two busiest screens were redesigned after feedback.</w:t>
       </w:r>
     </w:p>
     <w:p>
@@ -59,7 +59,15 @@
           <w:color w:val="C2410C"/>
           <w:sz w:val="26"/>
         </w:rPr>
-        <w:t>1. All QA findings fixed</w:t>
+        <w:t>1. Real partner data for an actual round — uploaded, awaiting processing</w:t>
+      </w:r>
+    </w:p>
+    <w:p>
+      <w:pPr>
+        <w:spacing w:after="80"/>
+      </w:pPr>
+      <w:r>
+        <w:t>The Blue Nile Cycle (July 2026) is no longer a folder of files on OneDrive — it is a live round in the system, populated with the real documents the field team collected:</w:t>
       </w:r>
     </w:p>
     <w:p>
@@ -71,10 +79,10 @@
         <w:rPr>
           <w:b/>
         </w:rPr>
-        <w:t xml:space="preserve">Search crash (High): </w:t>
+        <w:t xml:space="preserve">62 partner organizations </w:t>
       </w:r>
       <w:r>
-        <w:t>the global search palette took the page down on first click. Root-caused to a shared dialog component and fixed — verified working with zero console errors.</w:t>
+        <w:t>are on the register: 37 from Partner Information Forms (each parsed into ~30 structured fields — identity, programme, financials, bank details, declarations, in Arabic and English), 22 from the bilingual nominated-organizations list, and 3 from the media-verification table.</w:t>
       </w:r>
     </w:p>
     <w:p>
@@ -86,10 +94,10 @@
         <w:rPr>
           <w:b/>
         </w:rPr>
-        <w:t xml:space="preserve">Dark mode (Medium): </w:t>
+        <w:t xml:space="preserve">The evidence travelled with them: </w:t>
       </w:r>
       <w:r>
-        <w:t>login and public pages could never go dark because the theme was only applied by a button inside the app. Dark mode now applies on every page at first paint.</w:t>
+        <w:t>38 partners carry their original PIF documents, 36 carry their sam.gov screening screenshots, 40 media-verification checks are recorded with links and verdicts, and the round holds the full crisis evidence pack (needs assessment, site factsheets, cluster alert). All 5 panel candidates are on the round roster.</w:t>
       </w:r>
     </w:p>
     <w:p>
@@ -101,10 +109,10 @@
         <w:rPr>
           <w:b/>
         </w:rPr>
-        <w:t xml:space="preserve">Translations (Medium): </w:t>
+        <w:t xml:space="preserve">Uploaded is not the same as processed. </w:t>
       </w:r>
       <w:r>
-        <w:t>all public and partner-facing pages were already translated — QA had hit internal admin consoles. The Partners console is now translated in all six languages (2,788 strings each); the remaining admin screens are listed in the backlog, user-facing ones first.</w:t>
+        <w:t>Every partner sits at “nominated” — the starting line. None has yet been through the endorsement, due-diligence, or bank-verification pipeline the system enforces before money can move. The automatic sanctions screen ran on import (all clear), but the human steps — community endorsements, DD clearance, payment-route verification — are the work now in front of the team. The step-by-step guide is in Blue_Nile_OB_Runbook_2026-07-15.docx.</w:t>
       </w:r>
     </w:p>
     <w:p>
@@ -116,18 +124,10 @@
         <w:rPr>
           <w:b/>
         </w:rPr>
-        <w:t xml:space="preserve">The four “API-only” features: </w:t>
+        <w:t xml:space="preserve">Sensitive data is now behind proper controls: </w:t>
       </w:r>
       <w:r>
-        <w:t>Nominate Partner and donor Follow buttons were built; FSP registration and Assign Verifier already existed — the QA test pack should be refreshed.</w:t>
-      </w:r>
-    </w:p>
-    <w:p>
-      <w:pPr>
-        <w:spacing w:after="40"/>
-      </w:pPr>
-      <w:r>
-        <w:t>Details in: QA_Fixes_Search_DarkMode_Translations_2026-07-15.docx</w:t>
+        <w:t>the PIFs contain bank accounts and personal phone numbers that used to circulate as plain files. In the system they sit behind the Oversight-Body-only permission layer, tested on every release.</w:t>
       </w:r>
     </w:p>
     <w:p>
@@ -140,50 +140,7 @@
           <w:color w:val="C2410C"/>
           <w:sz w:val="26"/>
         </w:rPr>
-        <w:t>2. Cleaner grant and round pages (feedback: “too busy”)</w:t>
-      </w:r>
-    </w:p>
-    <w:p>
-      <w:pPr>
-        <w:pStyle w:val="ListBullet"/>
-        <w:spacing w:after="40"/>
-      </w:pPr>
-      <w:r>
-        <w:rPr>
-          <w:b/>
-        </w:rPr>
-        <w:t xml:space="preserve">Round activity: </w:t>
-      </w:r>
-      <w:r>
-        <w:t>the card that showed hundreds of raw system codes now rolls activity up into readable counts (“Evidence file attached ×98”) plus the six most recent events in plain English. Every system event now has a human-readable label.</w:t>
-      </w:r>
-    </w:p>
-    <w:p>
-      <w:pPr>
-        <w:pStyle w:val="ListBullet"/>
-        <w:spacing w:after="40"/>
-      </w:pPr>
-      <w:r>
-        <w:rPr>
-          <w:b/>
-        </w:rPr>
-        <w:t xml:space="preserve">Grant page: </w:t>
-      </w:r>
-      <w:r>
-        <w:t>the raw AI-extraction data is collapsed behind a single line (click to inspect), and empty sections take one quiet line instead of a tall box.</w:t>
-      </w:r>
-    </w:p>
-    <w:p>
-      <w:pPr>
-        <w:spacing w:before="240" w:after="60"/>
-      </w:pPr>
-      <w:r>
-        <w:rPr>
-          <w:b/>
-          <w:color w:val="C2410C"/>
-          <w:sz w:val="26"/>
-        </w:rPr>
-        <w:t>3. The QCF grant is fully in the system</w:t>
+        <w:t>2. An actual donor grant — the one funding this round</w:t>
       </w:r>
     </w:p>
     <w:p>
@@ -191,7 +148,7 @@
         <w:spacing w:after="80"/>
       </w:pPr>
       <w:r>
-        <w:t>The signed agreement with Quadrature Climate Foundation (via Myriad USA, ref 01-21-000480) was uploaded and the system’s AI read the contract — every extracted term was checked against the document before saving:</w:t>
+        <w:t>The signed grant agreement with Quadrature Climate Foundation (via Myriad USA, ref 01-21-000480) was uploaded and the system’s AI read the contract; every extracted term was checked against the document before saving. This is not test data — it is the grant that pays for the Blue Nile round, and the full $2M is allocated to it in the system.</w:t>
       </w:r>
     </w:p>
     <w:p>
@@ -236,7 +193,7 @@
         <w:t xml:space="preserve">First report on record: </w:t>
       </w:r>
       <w:r>
-        <w:t>the annual narrative + financial report (due 31 May 2026) was completed before this record existed; it is logged as submitted, marked retroactive, and the audit chain says so honestly. When QCF acknowledges it, one click moves it to accepted; attach the sent PDF when a copy is at hand.</w:t>
+        <w:t>the annual report (due 31 May 2026) was completed before this record existed; it is logged as submitted with an honest retroactive note on the audit chain. When QCF acknowledges it, one click moves it to accepted.</w:t>
       </w:r>
     </w:p>
     <w:p>
@@ -248,10 +205,10 @@
         <w:rPr>
           <w:b/>
         </w:rPr>
-        <w:t xml:space="preserve">Deliverables tracked: </w:t>
+        <w:t xml:space="preserve">The agreement’s own targets are now tracked: </w:t>
       </w:r>
       <w:r>
-        <w:t>the agreement’s own targets (50 mutual aid groups in Year 1, 200+ by Year 3, $5M additional funding, and more) now sit on the grant page and will be measured against live system data.</w:t>
+        <w:t>50 mutual aid groups funded in Year 1, 200+ by Year 3, $5M additional funding secured — the grant page measures these against live system data as the round executes.</w:t>
       </w:r>
     </w:p>
     <w:p>
@@ -266,22 +223,7 @@
         <w:t xml:space="preserve">Compliance terms captured: </w:t>
       </w:r>
       <w:r>
-        <w:t>the AI also extracted 15 obligations worth knowing — sanctions screening on all partners (the system already does this automatically), separate accounts, 7-year record retention, a 20% cap on moving budget between categories without QCF consent, and prior written consent for any use of QCF’s name or logo.</w:t>
-      </w:r>
-    </w:p>
-    <w:p>
-      <w:pPr>
-        <w:pStyle w:val="ListBullet"/>
-        <w:spacing w:after="40"/>
-      </w:pPr>
-      <w:r>
-        <w:rPr>
-          <w:b/>
-        </w:rPr>
-        <w:t xml:space="preserve">Tied to Blue Nile: </w:t>
-      </w:r>
-      <w:r>
-        <w:t>the full $2M is allocated to the Blue Nile Cycle. When later rounds draw on this grant, the allocation gets split — the note on the record says so.</w:t>
+        <w:t>15 obligations extracted from the contract — sanctions screening on all partners (already automatic), separate accounts, 7-year record retention, a 20% cap on budget reallocation without QCF consent, and prior written consent for use of QCF’s name or logo.</w:t>
       </w:r>
     </w:p>
     <w:p>
@@ -294,7 +236,7 @@
           <w:color w:val="C2410C"/>
           <w:sz w:val="26"/>
         </w:rPr>
-        <w:t>4. QCF has its own window into the round</w:t>
+        <w:t>3. QCF has its own window into the round</w:t>
       </w:r>
     </w:p>
     <w:p>
@@ -345,7 +287,67 @@
           <w:color w:val="C2410C"/>
           <w:sz w:val="26"/>
         </w:rPr>
-        <w:t>What happens next</w:t>
+        <w:t>4. All QA findings fixed</w:t>
+      </w:r>
+    </w:p>
+    <w:p>
+      <w:pPr>
+        <w:pStyle w:val="ListBullet"/>
+        <w:spacing w:after="40"/>
+      </w:pPr>
+      <w:r>
+        <w:rPr>
+          <w:b/>
+        </w:rPr>
+        <w:t xml:space="preserve">Search crash (High): </w:t>
+      </w:r>
+      <w:r>
+        <w:t>the global search palette took the page down on first click — root-caused and fixed, verified with zero console errors.</w:t>
+      </w:r>
+    </w:p>
+    <w:p>
+      <w:pPr>
+        <w:pStyle w:val="ListBullet"/>
+        <w:spacing w:after="40"/>
+      </w:pPr>
+      <w:r>
+        <w:rPr>
+          <w:b/>
+        </w:rPr>
+        <w:t xml:space="preserve">Dark mode (Medium): </w:t>
+      </w:r>
+      <w:r>
+        <w:t>now applies on every page at first paint, including login and public pages.</w:t>
+      </w:r>
+    </w:p>
+    <w:p>
+      <w:pPr>
+        <w:pStyle w:val="ListBullet"/>
+        <w:spacing w:after="40"/>
+      </w:pPr>
+      <w:r>
+        <w:rPr>
+          <w:b/>
+        </w:rPr>
+        <w:t xml:space="preserve">Translations (Medium): </w:t>
+      </w:r>
+      <w:r>
+        <w:t>all public and partner-facing pages were already translated; the Partners console joined them in all six languages (2,788 strings each). Remaining admin screens are listed in the backlog.</w:t>
+      </w:r>
+    </w:p>
+    <w:p>
+      <w:pPr>
+        <w:pStyle w:val="ListBullet"/>
+        <w:spacing w:after="40"/>
+      </w:pPr>
+      <w:r>
+        <w:rPr>
+          <w:b/>
+        </w:rPr>
+        <w:t xml:space="preserve">The four “API-only” features: </w:t>
+      </w:r>
+      <w:r>
+        <w:t>Nominate Partner and donor Follow buttons were built; FSP registration and Assign Verifier already existed — the QA test pack should be refreshed.</w:t>
       </w:r>
     </w:p>
     <w:p>
@@ -353,7 +355,50 @@
         <w:spacing w:after="40"/>
       </w:pPr>
       <w:r>
-        <w:t>The round is funded and the donor is watching — the remaining work is the partner pipeline: recruit community endorsers (the long pole), collect two conflict-of-interest-clear endorsements per partner, clear due diligence, verify payment routes, and start disbursing. The step-by-step guide with screenshots is in Blue_Nile_OB_Runbook_2026-07-15.docx.</w:t>
+        <w:t>Details in: QA_Fixes_Search_DarkMode_Translations_2026-07-15.docx</w:t>
+      </w:r>
+    </w:p>
+    <w:p>
+      <w:pPr>
+        <w:spacing w:before="240" w:after="60"/>
+      </w:pPr>
+      <w:r>
+        <w:rPr>
+          <w:b/>
+          <w:color w:val="C2410C"/>
+          <w:sz w:val="26"/>
+        </w:rPr>
+        <w:t>5. Cleaner grant and round pages (feedback: “too busy”)</w:t>
+      </w:r>
+    </w:p>
+    <w:p>
+      <w:pPr>
+        <w:pStyle w:val="ListBullet"/>
+        <w:spacing w:after="40"/>
+      </w:pPr>
+      <w:r>
+        <w:rPr>
+          <w:b/>
+        </w:rPr>
+        <w:t xml:space="preserve">Round activity: </w:t>
+      </w:r>
+      <w:r>
+        <w:t>the card that showed hundreds of raw system codes now rolls activity up into readable counts (“Evidence file attached ×98”) plus the six most recent events in plain English.</w:t>
+      </w:r>
+    </w:p>
+    <w:p>
+      <w:pPr>
+        <w:pStyle w:val="ListBullet"/>
+        <w:spacing w:after="40"/>
+      </w:pPr>
+      <w:r>
+        <w:rPr>
+          <w:b/>
+        </w:rPr>
+        <w:t xml:space="preserve">Grant page: </w:t>
+      </w:r>
+      <w:r>
+        <w:t>raw AI-extraction data is collapsed behind a single line (click to inspect); empty sections take one quiet line instead of a tall box.</w:t>
       </w:r>
     </w:p>
     <w:p>
@@ -366,7 +411,7 @@
           <w:color w:val="1B7A3D"/>
           <w:sz w:val="21"/>
         </w:rPr>
-        <w:t>Bottom line: the QA slate is clean, the noisiest screens are readable, and for the first time the full chain is live in one system — donor agreement → funding → round → 62 partners → donor visibility. Money can start moving as soon as partners clear endorsement.</w:t>
+        <w:t>Bottom line: for the first time, the full chain is real and live in one system — a signed donor agreement, $2M received, a funded round, 62 real partner organizations with their evidence, and the donor watching through their own portal. The data is in; processing it through endorsement and due diligence is what stands between here and the first disbursement.</w:t>
       </w:r>
     </w:p>
     <w:p>

</xml_diff>